<commit_message>
feat(linux-installer): add Linux installation profile validation and tests
- Implemented validation for Linux installation profiles using Pydantic.
- Added tests for rejecting unsafe recipes and ensuring correct profile resolution.
- Created Dockerfile for testing Linux installer with necessary dependencies.
- Added tests for CLI and native package management (deb, rpm, arch).
- Implemented system journal tests for recovery from interruptions.
- Added verification script for shell scripts and unit tests.
- Created JSON schema for Linux installation profiles.
- Added frontend tests for Linux target dialog and installation profiles.
</commit_message>
<xml_diff>
--- a/docs/informes/Informe_cronologico_Batch-Downloader_2026-07-28.docx
+++ b/docs/informes/Informe_cronologico_Batch-Downloader_2026-07-28.docx
@@ -60,7 +60,7 @@
         <w:jc w:val="center"/>
       </w:pPr>
       <w:r>
-        <w:t>Periodo analizado: 16 de junio - 2 de septiembre de 2026</w:t>
+        <w:t>Periodo analizado: 16 de junio - 8 de septiembre de 2026</w:t>
       </w:r>
     </w:p>
     <w:p>
@@ -69,7 +69,7 @@
         <w:jc w:val="center"/>
       </w:pPr>
       <w:r>
-        <w:t>Elaborado a partir de las conversaciones recuperadas, el historial Git y la evidencia local verificada hasta el 2 de septiembre de 2026</w:t>
+        <w:t>Elaborado a partir de las conversaciones recuperadas, el historial Git y la evidencia local verificada hasta el 8 de septiembre de 2026</w:t>
       </w:r>
     </w:p>
     <w:p>
@@ -95,7 +95,7 @@
         <w:ind w:left="259" w:right="173"/>
       </w:pPr>
       <w:r>
-        <w:t>El resultado verificado en Git es un monorepo en la rama development con 167 commits visibles y HEAD 5834478. Desde el corte anterior se integraron dos commits: la actualización del informe y la revisión de la política de contraseñas/verificación en backend, frontend, contratos y traducciones. Hay además cambios locales de una corrección del incidente de ordenación del catálogo que todavía no están integrados.</w:t>
+        <w:t>El resultado verificado en Git es un monorepo en la rama development con 169 commits visibles y HEAD aed581a. Desde el corte anterior se integró el instalador Linux con scripts de instalación, desinstalación, actualización y verificación, además de pruebas. El working tree contiene cambios locales de integración de perfiles Linux, contratos, frontend y pruebas que todavía no están integrados.</w:t>
       </w:r>
     </w:p>
     <w:tbl>
@@ -192,7 +192,7 @@
           </w:tcPr>
           <w:p>
             <w:r>
-              <w:t>commits visibles en HEAD</w:t>
+              <w:t>169</w:t>
             </w:r>
           </w:p>
         </w:tc>
@@ -210,7 +210,7 @@
           </w:tcPr>
           <w:p>
             <w:r>
-              <w:t>servicios en los Compose de HEAD</w:t>
+              <w:t>16</w:t>
             </w:r>
           </w:p>
         </w:tc>
@@ -260,7 +260,7 @@
         </w:numPr>
       </w:pPr>
       <w:r>
-        <w:t>Este informe combina historiales de tareas de Codex vinculadas al proyecto, el repositorio hermano de la memoria LaTeX, la organización del proyecto en GitHub y el historial Git local hasta el commit 08a43bfc del 24 de agosto de 2026, verificado el 25 de agosto. También se contrastaron README.md, .github/copilot-instructions.md, OpenAPI, los dos Compose, el estado del working tree y el árbol documental LaTeX.</w:t>
+        <w:t>Este informe combina historiales de tareas de Codex vinculadas al proyecto, el repositorio hermano de la memoria LaTeX, la organización del proyecto en GitHub y el historial Git local hasta el commit aed581a del 7 de septiembre de 2026, verificado el 8 de septiembre. También se contrastaron README.md, .github/copilot-instructions.md, OpenAPI, los dos Compose, el estado del working tree y el árbol documental LaTeX.</w:t>
       </w:r>
     </w:p>
     <w:p>
@@ -304,7 +304,7 @@
         </w:numPr>
       </w:pPr>
       <w:r>
-        <w:t>No se arrancó ni reinició la aplicación completa para preparar este informe. Los resultados desplegados y suites citados en fechas anteriores siguen siendo evidencia histórica. En esta ejecución se verificaron Git, configuración, ambos Compose de HEAD y el árbol LaTeX; la corrección local del catálogo conserva validaciones focalizadas de su tarea de origen, pero no se reejecutaron aquí ni se extrapolan a un benchmark global.</w:t>
+        <w:t>No se arrancó ni reinició la aplicación completa para preparar este informe. Los resultados desplegados y suites citados en fechas anteriores siguen siendo evidencia histórica. En esta ejecución se verificaron Git, configuración, ambos Compose de HEAD y el árbol LaTeX; los cambios locales del instalador Linux y el plan de selección por fuente no se presentan como integrados ni revalidados.</w:t>
       </w:r>
     </w:p>
     <w:p>
@@ -3863,6 +3863,34 @@
     </w:p>
     <w:p>
       <w:pPr>
+        <w:pStyle w:val="Ttulo2"/>
+      </w:pPr>
+      <w:r>
+        <w:t>3-7 de septiembre - Política de acceso y herramientas Linux</w:t>
+      </w:r>
+    </w:p>
+    <w:p>
+      <w:pPr/>
+      <w:r>
+        <w:t>HEAD integró la actualización de la política de contraseñas y verificación y el refactor del buscador para respetar el alcance seleccionado y gestionar descargas parciales. El 7 de septiembre se añadió el instalador Linux distribuido con binarios, librerías, plugins de formatos y gestores de paquetes, instalación, desinstalación, actualización y verificación, junto con la documentación y pruebas del runtime. La evidencia actual confirma el commit aed581a y 169 commits visibles, pero no una prueba de despliegue ni una ejecución completa de la aplicación.</w:t>
+      </w:r>
+    </w:p>
+    <w:p>
+      <w:pPr>
+        <w:pStyle w:val="Ttulo2"/>
+      </w:pPr>
+      <w:r>
+        <w:t>7-8 de septiembre - Trabajo local pendiente de integración</w:t>
+      </w:r>
+    </w:p>
+    <w:p>
+      <w:pPr/>
+      <w:r>
+        <w:t>El working tree contiene una migración de perfiles de instalación Linux, rutas internas y administrativas, cambios de contratos OpenAPI, resolución de candidatos, worker, Compose y nuevas pruebas Java, Python, Bash y frontend. Se conserva como trabajo local no integrado y no se afirma que sus pruebas pasen en conjunto. La tarea «Integra selección en Descargar ZIP» quedó en fase de plan: propone transportar pares appId/sourceRef, rechazar fuentes no disponibles con 409 y omitir el diálogo Linux solo para una fuente individual exacta; no hubo edición ni validación de esa funcionalidad.</w:t>
+      </w:r>
+    </w:p>
+    <w:p>
+      <w:pPr>
         <w:pStyle w:val="Ttulo1"/>
       </w:pPr>
       <w:r>
@@ -4069,6 +4097,12 @@
       </w:pPr>
       <w:r>
         <w:t>Apéndice A. Conversaciones recuperadas</w:t>
+      </w:r>
+    </w:p>
+    <w:p>
+      <w:pPr/>
+      <w:r>
+        <w:t>Corte 08-09-2026: HEAD local development aed581a/169 commits; ambos Compose enumeran 16 servicios. Se recuperaron tareas nuevas sobre el instalador Linux y la selección de fuentes en ZIP. La primera aporta el plan pendiente; la segunda permanece activa y no se usa como evidencia de implementación. LaTeX sigue en 6c0649c/33 commits con cambios locales y PDFs de julio sin recompilación verificable.</w:t>
       </w:r>
     </w:p>
     <w:p>
@@ -5940,6 +5974,70 @@
           </w:p>
         </w:tc>
       </w:tr>
+      <w:tr>
+        <w:tc>
+          <w:tcPr>
+            <w:tcW w:type="dxa" w:w="1200"/>
+          </w:tcPr>
+          <w:p>
+            <w:r>
+              <w:t>7 sep</w:t>
+            </w:r>
+          </w:p>
+        </w:tc>
+        <w:tc>
+          <w:tcPr>
+            <w:tcW w:type="dxa" w:w="4200"/>
+          </w:tcPr>
+          <w:p>
+            <w:r>
+              <w:t>Integra selección en Descargar ZIP</w:t>
+            </w:r>
+          </w:p>
+        </w:tc>
+        <w:tc>
+          <w:tcPr>
+            <w:tcW w:type="dxa" w:w="3960"/>
+          </w:tcPr>
+          <w:p>
+            <w:r>
+              <w:t>01a07ce5-d69c-7630-ae1b-5f3804f307e6</w:t>
+            </w:r>
+          </w:p>
+        </w:tc>
+      </w:tr>
+      <w:tr>
+        <w:tc>
+          <w:tcPr>
+            <w:tcW w:type="dxa" w:w="1200"/>
+          </w:tcPr>
+          <w:p>
+            <w:r>
+              <w:t>8 sep</w:t>
+            </w:r>
+          </w:p>
+        </w:tc>
+        <w:tc>
+          <w:tcPr>
+            <w:tcW w:type="dxa" w:w="4200"/>
+          </w:tcPr>
+          <w:p>
+            <w:r>
+              <w:t>Planifica instalador Linux sencillo</w:t>
+            </w:r>
+          </w:p>
+        </w:tc>
+        <w:tc>
+          <w:tcPr>
+            <w:tcW w:type="dxa" w:w="3960"/>
+          </w:tcPr>
+          <w:p>
+            <w:r>
+              <w:t>01a07a9a-47dd-7960-8dd8-6c74a446f39c</w:t>
+            </w:r>
+          </w:p>
+        </w:tc>
+      </w:tr>
     </w:tbl>
     <w:p>
       <w:pPr>
@@ -5951,7 +6049,7 @@
         <w:pStyle w:val="Ttulo1"/>
       </w:pPr>
       <w:r>
-        <w:t>Batch-Downloader integra un scraper con ámbitos y evidencia de ausencia, políticas transversales mediante wrappers, una experiencia pública más precisa y accesible, el flujo de descargas manuales y la política de contraseñas/verificación de 5834478. El checkout local de development queda en eaa845b con 168 commits; origin/main contiene la fusión de PR #50. Ambos Compose mantienen 17 servicios de aplicación y perfiles auxiliares documentados. La corrección del incidente de memoria de ordenación y los cambios locales recientes del scraper quedan como trabajo no integrado. La carga, la validación de despliegue y la recompilación LaTeX siguen pendientes.</w:t>
+        <w:t>Batch-Downloader integra un scraper con ámbitos y evidencia de ausencia, políticas transversales mediante wrappers, una experiencia pública más precisa y accesible, el flujo de descargas manuales, la política de contraseñas/verificación y ahora el instalador Linux con scripts operativos y pruebas en HEAD aed581a. Ambos Compose enumeran 16 servicios. Los cambios locales de perfiles Linux y el plan de selección de fuentes para ZIP quedan sin integrar; la carga, la validación de despliegue y la recompilación LaTeX siguen pendientes.</w:t>
       </w:r>
     </w:p>
     <w:tbl>
@@ -6426,7 +6524,7 @@
     </w:p>
     <w:p>
       <w:r>
-        <w:t>Batch-Downloader ya integra un scraper con ámbitos y evidencia de ausencia, políticas transversales mediante wrappers, una experiencia pública más precisa y accesible, el flujo de descargas manuales y la política de contraseñas/verificación actualizada. El checkout local de development queda en eaa845b con 168 commits; origin/main contiene la fusión de PR #50. Ambos Compose mantienen 17 servicios de aplicación y perfiles auxiliares documentados. Los cambios locales recientes del scraper y la corrección del ordenamiento del catálogo tienen que integrarse y validarse aparte. La carga y la validación de despliegue siguen pendientes.</w:t>
+        <w:t>Batch-Downloader mantiene una base integrada de scraper, catálogo, descargas y autenticación, y añade en HEAD aed581a un instalador Linux operativo con scripts y pruebas. El checkout local de development queda en 169 commits y ambos Compose enumeran 16 servicios. Los cambios locales de perfiles Linux y la integración de selecciones explícitas en ZIP requieren integración y validación separadas. La carga, la validación de despliegue y la recompilación LaTeX siguen pendientes.</w:t>
       </w:r>
     </w:p>
     <w:p/>

</xml_diff>

<commit_message>
chore(docs): record changes from 2026-09-12
Grupo por fecha de modificacion y componente: 2026-09-12 / docs.
1 ficheros; M=1.
Actualiza documentacion, informe evolutivo y baseline de calidad.
Rutas registradas: 1.
</commit_message>
<xml_diff>
--- a/docs/informes/Informe_cronologico_Batch-Downloader_2026-07-28.docx
+++ b/docs/informes/Informe_cronologico_Batch-Downloader_2026-07-28.docx
@@ -3894,6 +3894,26 @@
         <w:pStyle w:val="Ttulo1"/>
       </w:pPr>
       <w:r>
+        <w:t>8-9 de septiembre - Instalador Linux y validación de perfiles</w:t>
+      </w:r>
+    </w:p>
+    <w:p>
+      <w:pPr/>
+      <w:r>
+        <w:t>HEAD avanzó de aed581a/169 commits a a2c32e0/170 commits. El nuevo commit integra validación de perfiles de instalación Linux y pruebas adicionales para scraper, API interna, candidatos, rutas de instalación, sistema nativo, CLI, migración, Core, worker, ZIP y frontend. También incorpora el contrato OpenAPI y el esquema JSON del perfil, ajustes de Compose y un Dockerfile de pruebas. Es evidencia confirmada en Git; no demuestra despliegue ni ejecución completa de la aplicación.</w:t>
+      </w:r>
+    </w:p>
+    <w:p>
+      <w:pPr/>
+      <w:r>
+        <w:t>El trabajo integrado del instalador Linux queda ampliado con controles de validación y cobertura focalizada, pero siguen sin demostrarse una prueba de carga, una validación en despliegue y la integración de la selección explícita de fuentes en ZIP. La tarea nueva de reducción de líneas y deuda técnica terminó como análisis/plan y dejó un cambio local aislado en NotificationProcessingException; no se presenta como funcionalidad integrada.</w:t>
+      </w:r>
+    </w:p>
+    <w:p>
+      <w:pPr>
+        <w:pStyle w:val="Ttulo1"/>
+      </w:pPr>
+      <w:r>
         <w:t>Pendientes y riesgos abiertos</w:t>
       </w:r>
     </w:p>
@@ -4102,7 +4122,7 @@
     <w:p>
       <w:pPr/>
       <w:r>
-        <w:t>Corte 08-09-2026: HEAD local development aed581a/169 commits; ambos Compose enumeran 16 servicios. Se recuperaron tareas nuevas sobre el instalador Linux y la selección de fuentes en ZIP. La primera aporta el plan pendiente; la segunda permanece activa y no se usa como evidencia de implementación. LaTeX sigue en 6c0649c/33 commits con cambios locales y PDFs de julio sin recompilación verificable.</w:t>
+        <w:t>Corte 09-09-2026: HEAD local development a2c32e0/170 commits; ambos Compose enumeran 16 servicios. Se recuperaron tareas nuevas sobre el análisis de deuda técnica y la selección de fuentes en ZIP; ambas se mantienen como plan o trabajo no integrado. LaTeX sigue en 6c0649c/33 commits con cambios locales y PDFs de julio sin recompilación verificable.</w:t>
       </w:r>
     </w:p>
     <w:p>
@@ -6049,7 +6069,7 @@
         <w:pStyle w:val="Ttulo1"/>
       </w:pPr>
       <w:r>
-        <w:t>Batch-Downloader integra un scraper con ámbitos y evidencia de ausencia, políticas transversales mediante wrappers, una experiencia pública más precisa y accesible, el flujo de descargas manuales, la política de contraseñas/verificación y ahora el instalador Linux con scripts operativos y pruebas en HEAD aed581a. Ambos Compose enumeran 16 servicios. Los cambios locales de perfiles Linux y el plan de selección de fuentes para ZIP quedan sin integrar; la carga, la validación de despliegue y la recompilación LaTeX siguen pendientes.</w:t>
+        <w:t>Batch-Downloader integra un scraper con ámbitos y evidencia de ausencia, políticas transversales mediante wrappers, una experiencia pública más precisa y accesible, el flujo de descargas manuales, la política de contraseñas/verificación y un instalador Linux con validación de perfiles, scripts operativos, contratos y pruebas en HEAD a2c32e0. Ambos Compose enumeran 16 servicios. Los cambios locales y el plan de selección de fuentes para ZIP quedan sin integrar; la carga, la validación de despliegue y la recompilación LaTeX siguen pendientes.</w:t>
       </w:r>
     </w:p>
     <w:tbl>
@@ -6524,10 +6544,50 @@
     </w:p>
     <w:p>
       <w:r>
-        <w:t>Batch-Downloader mantiene una base integrada de scraper, catálogo, descargas y autenticación, y añade en HEAD aed581a un instalador Linux operativo con scripts y pruebas. El checkout local de development queda en 169 commits y ambos Compose enumeran 16 servicios. Los cambios locales de perfiles Linux y la integración de selecciones explícitas en ZIP requieren integración y validación separadas. La carga, la validación de despliegue y la recompilación LaTeX siguen pendientes.</w:t>
+        <w:t>Batch-Downloader mantiene una base integrada de scraper, catálogo, descargas y autenticación, y amplía en HEAD a2c32e0 el instalador Linux con validación de perfiles y pruebas focalizadas. El checkout local de development queda en 170 commits y ambos Compose enumeran 16 servicios. La integración de selecciones explícitas en ZIP, la carga, la validación de despliegue y la recompilación LaTeX siguen pendientes.</w:t>
       </w:r>
     </w:p>
     <w:p/>
+    <w:p>
+      <w:pPr>
+        <w:pStyle w:val="Ttulo2"/>
+      </w:pPr>
+      <w:r>
+        <w:t>9-12 de septiembre - Reducción técnica local y estado del checkout</w:t>
+      </w:r>
+    </w:p>
+    <w:p>
+      <w:pPr>
+        <w:pStyle w:val="Ttulo2"/>
+      </w:pPr>
+      <w:r>
+        <w:t>La tarea «Analiza y planifica reducción de LT» continuó con una revisión de servicios, APIs y documentación del scraper. Su resultado más reciente reporta una reducción neta de 43 líneas de producción y herramientas, 26 pruebas focalizadas, Ruff y Mypy sobre 78 archivos, y cambios locales para mejorar la comunicación de excepciones, cabeceras Javadoc y políticas de selección. Estos resultados pertenecen al working tree y no a un commit; por tanto, no se presentan como integración completada ni como validación global.</w:t>
+      </w:r>
+    </w:p>
+    <w:p>
+      <w:pPr>
+        <w:pStyle w:val="Ttulo2"/>
+      </w:pPr>
+      <w:r>
+        <w:t>El checkout principal conserva HEAD a2c32e0 y 170 commits. El informe existente ya recoge el instalador Linux integrado y sus pruebas; las modificaciones locales posteriores abarcan múltiples servicios, contratos, frontend, scraper, semántica, Compose y pruebas, además del propio DOCX. El árbol Batch-Downloader-Memoria sigue en 6c0649c y 33 commits, con cambios locales y sin PDF nuevo verificable. Ambos Compose mantienen 16 servicios.</w:t>
+      </w:r>
+    </w:p>
+    <w:p>
+      <w:pPr>
+        <w:pStyle w:val="Ttulo2"/>
+      </w:pPr>
+      <w:r>
+        <w:t>No se han confirmado desde el último corte un nuevo commit, un benchmark completo, un despliegue actualizado ni una recompilación visual de LaTeX. La selección explícita de fuentes en Descargar ZIP continúa siendo un plan y los cambios locales de reducción/deuda técnica permanecen pendientes de revisión, pruebas de interacción y decisión de integración.</w:t>
+      </w:r>
+    </w:p>
+    <w:p>
+      <w:pPr>
+        <w:pStyle w:val="Ttulo2"/>
+      </w:pPr>
+      <w:r>
+        <w:t>Corte 12-09-2026: se incorporó como fuente la continuación de la tarea «Analiza y planifica reducción de LT». La fuente reporta 43 líneas netas menos, 26 pruebas, Ruff y Mypy sobre 78 archivos y trabajo todavía local; no se trató como commit ni como resultado de runtime integrado.</w:t>
+      </w:r>
+    </w:p>
     <w:sectPr>
       <w:headerReference w:type="even" r:id="rId9"/>
       <w:headerReference w:type="default" r:id="rId10"/>

</xml_diff>

<commit_message>
chore(docs): update Informe cronologico with recent changes and modularization details
</commit_message>
<xml_diff>
--- a/docs/informes/Informe_cronologico_Batch-Downloader_2026-07-28.docx
+++ b/docs/informes/Informe_cronologico_Batch-Downloader_2026-07-28.docx
@@ -6586,6 +6586,47 @@
       </w:pPr>
       <w:r>
         <w:t>Corte 12-09-2026: se incorporó como fuente la continuación de la tarea «Analiza y planifica reducción de LT». La fuente reporta 43 líneas netas menos, 26 pruebas, Ruff y Mypy sobre 78 archivos y trabajo todavía local; no se trató como commit ni como resultado de runtime integrado.</w:t>
+      </w:r>
+    </w:p>
+    <w:p>
+      <w:pPr>
+        <w:pStyle w:val="Ttulo2"/>
+      </w:pPr>
+      <w:r>
+        <w:t>9-13 de septiembre - Modularización del Compose y consolidación del checkout</w:t>
+      </w:r>
+    </w:p>
+    <w:p>
+      <w:r>
+        <w:t>Desde el corte del 12 de septiembre el checkout principal avanzó de a2c32e0 (170 commits) a 0f90367 (210 commits). La nueva serie registra cambios integrados por servicio en scraper, Core, worker de descargas, notificaciones, traducciones, semántica, frontend, contratos, calidad y documentación, además de una eliminación registrada en Core. El árbol está limpio salvo el directorio local .codex/ de la automatización; no se interpreta esta actividad como prueba de despliegue.</w:t>
+      </w:r>
+    </w:p>
+    <w:p>
+      <w:r>
+        <w:t>El Compose raíz conserva la entrada única y ahora incluye archivos junto a los componentes: api/scraper y services/{core-api,webapp,semantic-service,notification-service,download-worker,translation-service}. La configuración local se mantiene separada de docker-compose.ghcr.yml. La validación disponible confirma 20 servicios con todos los perfiles y paridad de salud local/GHCR mediante scripts/compose_health.py; no se arrancó la aplicación completa.</w:t>
+      </w:r>
+    </w:p>
+    <w:p>
+      <w:r>
+        <w:t>La tarea Analiza y planifica reducción de LT dejó una revisión y un resultado focalizado: 43 líneas netas menos, 26 pruebas y Ruff/Mypy sobre 78 archivos. La implementación observada en el checkout es la que queda respaldada por los commits anteriores; cualquier parte que permanezca en el árbol de trabajo se considera local y no revalidada fuera de las comprobaciones citadas.</w:t>
+      </w:r>
+    </w:p>
+    <w:p>
+      <w:pPr>
+        <w:pStyle w:val="Ttulo2"/>
+      </w:pPr>
+      <w:r>
+        <w:t>Estado documental y pendientes actualizados</w:t>
+      </w:r>
+    </w:p>
+    <w:p>
+      <w:r>
+        <w:t>Batch-Downloader-Memoria permanece en 6c0649c (33 commits), con modificaciones locales en la memoria, anexos y diagramas. No hay PDF nuevo verificable, por lo que la edición de fuentes no se presenta como recompilación final. El pendiente de validación visual del rediseño de identidad, los benchmarks completos, la validación con proveedores reales y la sincronización final de RF-03 siguen abiertos.</w:t>
+      </w:r>
+    </w:p>
+    <w:p>
+      <w:r>
+        <w:t>Corte 13-09-2026: HEAD local development 0f90367/210 commits; el Compose raíz y los Compose por servicio mantienen una topología validada de 20 servicios. Se incorporaron al apéndice la continuación de la tarea de reducción técnica y la tarea de separación de Compose; sus resultados se distinguen entre integrados, locales y no verificados.</w:t>
       </w:r>
     </w:p>
     <w:sectPr>

</xml_diff>

<commit_message>
chore(docs): update .gitignore and add new sections to Informe cronologico
</commit_message>
<xml_diff>
--- a/docs/informes/Informe_cronologico_Batch-Downloader_2026-07-28.docx
+++ b/docs/informes/Informe_cronologico_Batch-Downloader_2026-07-28.docx
@@ -6626,7 +6626,41 @@
     </w:p>
     <w:p>
       <w:r>
-        <w:t>Corte 13-09-2026: HEAD local development 0f90367/210 commits; el Compose raíz y los Compose por servicio mantienen una topología validada de 20 servicios. Se incorporaron al apéndice la continuación de la tarea de reducción técnica y la tarea de separación de Compose; sus resultados se distinguen entre integrados, locales y no verificados.</w:t>
+        <w:t>Corte 14-09-2026: HEAD local development 5a51b1f/212 commits; el Compose raíz y los Compose por servicio mantienen una topología validada de 20 servicios. Se incorporaron al apéndice la continuación de la tarea de reducción técnica y la tarea de separación de Compose; sus resultados se distinguen entre integrados, locales y no verificados.</w:t>
+      </w:r>
+    </w:p>
+    <w:p>
+      <w:pPr>
+        <w:pStyle w:val="Ttulo2"/>
+      </w:pPr>
+      <w:r>
+        <w:t>14 de septiembre - Contrato explícito para ausencia de inspección manual</w:t>
+      </w:r>
+    </w:p>
+    <w:p>
+      <w:pPr/>
+      <w:r>
+        <w:t>El commit 5a51b1f actualiza de forma integrada el flujo de inspección de instaladores manuales. El endpoint interno del scraper y el endpoint administrativo de Core devuelven ahora null con HTTP 200 cuando no hay una inspección abierta, en lugar de convertir esa ausencia esperable en un 404. El contrato OpenAPI, el cliente Java, la API TypeScript y el editor administrativo quedan alineados con esa semántica; se añadieron o ajustaron pruebas de scraper, Core y frontend. El mismo commit también separa la consulta de ejecuciones activas de la consulta de la ejecución más reciente, evitando ordenar todo el historial para localizar un proceso en curso.</w:t>
+      </w:r>
+    </w:p>
+    <w:p>
+      <w:pPr>
+        <w:pStyle w:val="Ttulo2"/>
+      </w:pPr>
+      <w:r>
+        <w:t>Estado actual y documentación local</w:t>
+      </w:r>
+    </w:p>
+    <w:p>
+      <w:pPr/>
+      <w:r>
+        <w:t>HEAD local de development es 5a51b1f (212 commits). El DOCX ya había incorporado en 7b0295d la modularización y actualización documental del corte anterior. Los once ficheros Mermaid de docs/architecture permanecen sin seguimiento y, por tanto, se consideran documentación local todavía no integrada. Batch-Downloader-Memoria continúa en 6c0649c (33 commits), con cambios locales y sin PDF nuevo verificable. No se arrancó la aplicación completa ni se declara una validación de despliegue nueva.</w:t>
+      </w:r>
+    </w:p>
+    <w:p>
+      <w:pPr/>
+      <w:r>
+        <w:t>Corte 14-09-2026: HEAD local development 5a51b1f/212 commits; ambos Compose conservan la topología validada de 20 servicios. Se incorporó el cambio de contrato de inspecciones manuales y su cobertura de pruebas. La documentación Mermaid local y las modificaciones del árbol LaTeX siguen separadas como trabajo no integrado; no hay PDF nuevo verificable.</w:t>
       </w:r>
     </w:p>
     <w:sectPr>

</xml_diff>

<commit_message>
feat(migrations): expand shared contracts and remove obsolete projections
- Added migration 20260914_0021 to expand canonical contracts in the shared catalog and pipeline, including new unique constraints and foreign keys.
- Implemented checks for duplicate request IDs and orphaned scrape runs.
- Backfilled missing artifact fingerprints and ensured no null fingerprints exist.
- Added migration 20260914_0022 to remove obsolete links and projections after compatibility checks, including dropping unused indices and columns.
- Introduced a new SemanticStatusClient for querying the semantic service status with appropriate error handling.
- Added tests for migration contracts, ensuring proper index management and model validation.
- Created SQL procedures to ensure catalog projection tables are empty before removal.
</commit_message>
<xml_diff>
--- a/docs/informes/Informe_cronologico_Batch-Downloader_2026-07-28.docx
+++ b/docs/informes/Informe_cronologico_Batch-Downloader_2026-07-28.docx
@@ -6661,6 +6661,83 @@
       <w:pPr/>
       <w:r>
         <w:t>Corte 14-09-2026: HEAD local development 5a51b1f/212 commits; ambos Compose conservan la topología validada de 20 servicios. Se incorporó el cambio de contrato de inspecciones manuales y su cobertura de pruebas. La documentación Mermaid local y las modificaciones del árbol LaTeX siguen separadas como trabajo no integrado; no hay PDF nuevo verificable.</w:t>
+      </w:r>
+    </w:p>
+    <w:p>
+      <w:pPr>
+        <w:pStyle w:val="Ttulo2"/>
+      </w:pPr>
+      <w:r>
+        <w:t>15 de septiembre - Refactorización dirigida del MySQL compartido</w:t>
+      </w:r>
+    </w:p>
+    <w:p>
+      <w:r>
+        <w:t>La tarea Planificar refactorización MySQL concluyó con una propuesta de migración expand-contract para conservar un único esquema compartido. La decisión es mantener las tablas que representan capacidades activas, retirar únicamente las proyecciones catalog_app_projections y catalog_source_projections y sustituir la vista application_totals por lectura directa de catalog_counters. También se fijaron como objetivos la relación única comando-ejecución, la unicidad de huellas de resoluciones, la compactación de payloads terminales y una propiedad de migraciones más clara.</w:t>
+      </w:r>
+    </w:p>
+    <w:p>
+      <w:r>
+        <w:t>El checkout contiene cambios locales asociados a la implementación: las migraciones Alembic 0021 y 0022, Flyway V17, cambios en repositorios y modelos del scraper/Core, configuración de Compose y pruebas MySQL. El árbol no está limpio y estos cambios no se presentan como integrados ni como validados en un entorno reproducible. La tarea reporta una fotografía de 39 tablas funcionales, 1,12 GiB, 538 millones de filas examinadas y unos 293 MiB de payload terminal; son cifras de esa investigación local, no una medición nueva de este informe.</w:t>
+      </w:r>
+    </w:p>
+    <w:p>
+      <w:r>
+        <w:t>El criterio de aceptación mantiene pendientes la validación desde bases vacías y copias V16/0020, la repetición segura de Alembic/Flyway, la comprobación de huérfanos y duplicados, EXPLAIN ANALYZE, la reducción real de payloads, el scrape completo con retención y la repetición de las suites pertinentes. No se arrancó la aplicación.</w:t>
+      </w:r>
+    </w:p>
+    <w:p>
+      <w:pPr>
+        <w:pStyle w:val="Ttulo2"/>
+      </w:pPr>
+      <w:r>
+        <w:t>Estado actual y corte 15-09-2026</w:t>
+      </w:r>
+    </w:p>
+    <w:p>
+      <w:r>
+        <w:t>HEAD local de development es 5ee3138 (213 commits). Desde el corte anterior se confirmó además el commit 5ee3138, que actualiza el propio informe y su exclusión de archivos; el DOCX ya contiene los cambios documentados hasta 14-09-2026. El working tree mantiene modificaciones locales en README, Compose, scraper, Core, migraciones y pruebas. Batch-Downloader-Memoria continúa en 6c0649c (33 commits), con cambios locales y sin PDF nuevo verificable.</w:t>
+      </w:r>
+    </w:p>
+    <w:p>
+      <w:r>
+        <w:t>La recuperación de tareas añadió como fuente primaria la tarea Planificar refactorización MySQL, cuya implementación quedó en estado local/no verificado. Las tareas de diagramas y administración revisadas no aportan un resultado integrado nuevo que cierre pendientes del informe.</w:t>
+      </w:r>
+    </w:p>
+    <w:p>
+      <w:pPr>
+        <w:pStyle w:val="Ttulo2"/>
+      </w:pPr>
+      <w:r>
+        <w:t>16 de septiembre - Auditoría cuantitativa de simplificación</w:t>
+      </w:r>
+    </w:p>
+    <w:p>
+      <w:r>
+        <w:t>La tarea Analiza tamaño del proyecto terminó como auditoría de solo lectura. El resultado identifica como candidatos de reducción principalmente herramientas, pruebas y soporte operativo fuera de los servicios desplegables; no propone borrar código de producción sin medir duplicación, cobertura y contratos. La clasificación de support del inventario no corresponde a un microservicio ni a un contenedor. La tarea no modificó el checkout ni aporta una implementación integrada.</w:t>
+      </w:r>
+    </w:p>
+    <w:p>
+      <w:r>
+        <w:t>La auditoría también deja constancia de que la simplificación global y la documentación semántica del código no deben darse por cerradas: las cifras y recomendaciones pertenecen a un análisis estático reciente y no sustituyen una validación funcional, de contratos o de despliegue. Se conserva como pendiente decidir qué herramientas de soporte siguen siendo necesarias antes de eliminarlas.</w:t>
+      </w:r>
+    </w:p>
+    <w:p>
+      <w:pPr>
+        <w:pStyle w:val="Ttulo2"/>
+      </w:pPr>
+      <w:r>
+        <w:t>Estado actual y corte 16-09-2026</w:t>
+      </w:r>
+    </w:p>
+    <w:p>
+      <w:r>
+        <w:t>HEAD local de development permanece en 5ee3138 (213 commits). El working tree mantiene los cambios locales de la refactorización MySQL compartida y otros cambios documentales y de configuración; Alembic 0021/0022 y Flyway V17 siguen sin integrarse en HEAD, y la base actual no se ha promovido desde Alembic 0020/Flyway V16. Batch-Downloader-Memoria continúa en 6c0649c (33 commits), con modificaciones locales y sin PDF nuevo verificable. No se arrancó la aplicación completa ni se declara un despliegue nuevo.</w:t>
+      </w:r>
+    </w:p>
+    <w:p>
+      <w:r>
+        <w:t>Corte 16-09-2026: se incorporó al apéndice la tarea de auditoría cuantitativa de tamaño como análisis no mutante y no integrado. La propuesta de refactorización MySQL, sus pruebas y sus migraciones locales siguen separadas de los cambios confirmados en Git; las validaciones reportadas por esas tareas no se presentan como evidencia de promoción operativa.</w:t>
       </w:r>
     </w:p>
     <w:sectPr>

</xml_diff>

<commit_message>
feat(embeddings): validate embedding dimension type and raise error if invalid
</commit_message>
<xml_diff>
--- a/docs/informes/Informe_cronologico_Batch-Downloader_2026-07-28.docx
+++ b/docs/informes/Informe_cronologico_Batch-Downloader_2026-07-28.docx
@@ -6738,6 +6738,55 @@
     <w:p>
       <w:r>
         <w:t>Corte 16-09-2026: se incorporó al apéndice la tarea de auditoría cuantitativa de tamaño como análisis no mutante y no integrado. La propuesta de refactorización MySQL, sus pruebas y sus migraciones locales siguen separadas de los cambios confirmados en Git; las validaciones reportadas por esas tareas no se presentan como evidencia de promoción operativa.</w:t>
+      </w:r>
+    </w:p>
+    <w:p>
+      <w:pPr>
+        <w:pStyle w:val="Ttulo1"/>
+      </w:pPr>
+      <w:r>
+        <w:t>Actualización al 17 de septiembre de 2026</w:t>
+      </w:r>
+    </w:p>
+    <w:p>
+      <w:r>
+        <w:t>Desde el corte del 16 de septiembre, HEAD avanzó de 5ee3138 (213 commits) a e419323 (216 commits). Se integraron tres cambios: ampliación de contratos compartidos y retirada de proyecciones obsoletas mediante las migraciones Alembic 0021/0022 y Flyway V17; eliminación de la tabla software_requests con actualización de objetivos a V18; y declaración explícita de websockets 15.0.1 en Scraper y semantic-service.</w:t>
+      </w:r>
+    </w:p>
+    <w:p>
+      <w:r>
+        <w:t>La revisión de logs confirmó que el 503 semántico no procede de una caída del servicio: /semantic/health/ready respondió 200, pero el índice seguía incompleto, con 14.711 documentos, 2.080 embeddings completados y 12.631 pendientes, sin modelo activo. El indexador estaba fuera de su ventana configurada (01:00–07:00 UTC); no se ejecutó un reindexado durante la revisión.</w:t>
+      </w:r>
+    </w:p>
+    <w:p>
+      <w:r>
+        <w:t>También se aplicó localmente un ajuste de proxy_max_temp_file_size 0 en Nginx y se construyeron con código 0 las cuatro imágenes afectadas. Este último ajuste y los cambios locales observados en el checkout se consideran evidencia de trabajo no integrado si no aparecen en HEAD; no se declara recreado ni validado el stack en ejecución.</w:t>
+      </w:r>
+    </w:p>
+    <w:p>
+      <w:pPr>
+        <w:pStyle w:val="Ttulo1"/>
+      </w:pPr>
+      <w:r>
+        <w:t>Estado actual y pendientes</w:t>
+      </w:r>
+    </w:p>
+    <w:p>
+      <w:r>
+        <w:t>Confirmado e integrado: HEAD e419323, 216 commits, migraciones V17/V18 y dependencias websockets versionadas. Pendiente: completar y activar el índice semántico respetando una ventana controlada, validar la refactorización expand-contract contra datos históricos y revisar los cambios locales de Compose, scraper, Core, semantic-service, frontend y contratos antes de promoverlos. Batch-Downloader-Memoria continúa en 6c0649c (33 commits), con cambios locales y sin PDF nuevo verificable.</w:t>
+      </w:r>
+    </w:p>
+    <w:p>
+      <w:pPr>
+        <w:pStyle w:val="Ttulo1"/>
+      </w:pPr>
+      <w:r>
+        <w:t>Apéndice de conversaciones</w:t>
+      </w:r>
+    </w:p>
+    <w:p>
+      <w:r>
+        <w:t>17-09-2026 — Revisa logs y detecta errores: se corrigieron localmente las dependencias WebSocket y el buffering temporal de Nginx; las imágenes afectadas terminaron sus builds con código 0. La causa del 503 semántico quedó atribuida al índice incompleto y a la ventana horaria cerrada.</w:t>
       </w:r>
     </w:p>
     <w:sectPr>

</xml_diff>